<commit_message>
Refund policy for digital downloads, plus the approved content corrections
Replaces the voluntary 14 day money back guarantee on every paid digital
product with a digital download refund policy: a free sample before purchase,
no change-of-mind refunds once the files have been accessed, and a promise to
put right a double charge, files that cannot be opened, or a product that is
defective or not as described. Statutory rights are stated as unaffected.

Also carries the 76 approved first-round content corrections, and repaints the
four premium cover images whose footline still promised the old guarantee.

Excludes the motor-copy-v1 branch commit and every other working copy change.

Co-Authored-By: Claude Opus 5 <noreply@anthropic.com>
</commit_message>
<xml_diff>
--- a/resources/a-level-business-7138-switchover/A-Level-Business-7138-The-Switchover-Pack-EDITABLE.docx
+++ b/resources/a-level-business-7138-switchover/A-Level-Business-7138-The-Switchover-Pack-EDITABLE.docx
@@ -84,7 +84,7 @@
           <w:i w:val="0"/>
           <w:sz w:val="21"/>
         </w:rPr>
-        <w:t>filestore.aqa.org.uk → Business → AS and A-level Business 7137, 7138 specification. The direct link is on page 9.</w:t>
+        <w:t>aqa.org.uk/7138 → the specification, printed on every page of the document itself. The source table is on page 9.</w:t>
       </w:r>
     </w:p>
     <w:p>
@@ -919,6 +919,19 @@
         <w:rPr>
           <w:b w:val="0"/>
           <w:i w:val="0"/>
+          <w:sz w:val="21"/>
+        </w:rPr>
+        <w:t xml:space="preserve">Assessments and certification for the AS specification are available for the first time in May/June 2027 and then every May/June for the life of the specification. Assessments and certification for the A-level specification are available for the first time in May/June 2028 and then every May/June for the life of the specification.</w:t>
+      </w:r>
+    </w:p>
+    <w:p>
+      <w:pPr>
+        <w:ind w:left="397"/>
+      </w:pPr>
+      <w:r>
+        <w:rPr>
+          <w:b w:val="0"/>
+          <w:i w:val="0"/>
           <w:sz w:val="18"/>
         </w:rPr>
         <w:t>AQA 7137 and 7138 specification, section 4, Scheme of assessment</w:t>
@@ -1020,7 +1033,7 @@
           <w:i w:val="0"/>
           <w:sz w:val="21"/>
         </w:rPr>
-        <w:t xml:space="preserve"> Open the 7137 and 7138 specification and go to section 4, Scheme of assessment. The first paragraph carries all four dates above.</w:t>
+        <w:t xml:space="preserve"> Open the 7137 and 7138 specification, section 4: its opening carries the two assessment dates. First teaching is on the cover, and the 7132 end date is on the AQA 7132 page.</w:t>
       </w:r>
     </w:p>
     <w:p>
@@ -1964,7 +1977,7 @@
           <w:i w:val="0"/>
           <w:sz w:val="21"/>
         </w:rPr>
-        <w:t xml:space="preserve"> Both specifications have a section called Financial management: on 7132 it is 3.5, the fifth of ten, and on 7138 it is 3.1.4, inside the first unit. And the A-level only material is still a block at the end, but it has grown. On 7132 it was four sections that were all strategy. On 7138 it is the whole of Unit 3.3, which puts business and society and the external environment alongside strategy and change, and there is now one more A-level only section, 3.2.3, sitting inside Unit 2.</w:t>
+        <w:t xml:space="preserve"> Both specifications have a section called Financial management: on 7132 it is 3.5, the fifth of ten, and on 7138 it is 3.1.4, inside the first unit. And the A-level only material is still a block at the end, but it has grown. On 7132 it was four sections that were all strategy. On 7138 it is the whole of Unit 3.3, which puts business and society and the external environment alongside strategy and change, and five further (A-level only) rows sit inside Units 3.1 and 3.2, from international marketing to ethics, plus 3.2.3.</w:t>
       </w:r>
     </w:p>
     <w:p>
@@ -1997,7 +2010,7 @@
           <w:i w:val="0"/>
           <w:sz w:val="21"/>
         </w:rPr>
-        <w:t xml:space="preserve"> 7138 subject content, sections 3.1 to 3.3. AQA prints "(A-level only)" on the Unit 3.3 heading itself and "(A-level)" on section 3.2.3. Nothing in Units 3.1 and 3.2 carries a label otherwise, and the AS papers assess only those two units.</w:t>
+        <w:t xml:space="preserve"> 7138 subject content, sections 3.1 to 3.3. AQA prints "(A-level only)" on the Unit 3.3 heading itself and "(A-level)" on section 3.2.3, and on five further "(A-level only)" content rows inside Units 3.1 and 3.2.</w:t>
       </w:r>
     </w:p>
     <w:p>
@@ -3011,7 +3024,7 @@
           <w:i w:val="0"/>
           <w:sz w:val="21"/>
         </w:rPr>
-        <w:t xml:space="preserve"> Specification section 2 for the paper tables, 4.2 and 4.3 for the weightings and the scaling, 4.6 for synoptic assessment.</w:t>
+        <w:t xml:space="preserve"> Specification section 2 for the paper tables, 4.2 and 4.3 for the weightings and the scaling, 4.5 for the strategic view, 4.6 for synoptic assessment.</w:t>
       </w:r>
     </w:p>
     <w:p>
@@ -3572,7 +3585,7 @@
           <w:i w:val="0"/>
           <w:sz w:val="23"/>
         </w:rPr>
-        <w:t>Two words have gone</w:t>
+        <w:t>Four words have gone</w:t>
       </w:r>
     </w:p>
     <w:p>
@@ -3582,7 +3595,7 @@
           <w:i w:val="0"/>
           <w:sz w:val="21"/>
         </w:rPr>
-        <w:t>AQA's published command word list for 7132 had seven entries: Analyse, Calculate, Describe, Evaluate, Explain, Justify and To what extent. The 7138 list above has five, and neither Justify nor To what extent is on it. Assess, which was not on the 7132 list at all, is now a command word with a fixed tariff of nine.</w:t>
+        <w:t>AQA's published command word list for 7132 had seven entries: Analyse, Calculate, Describe, Evaluate, Explain, Justify and To what extent. The 7138 list above has five: Calculate, Describe, Justify and To what extent are not on it. Assess, which was not on the 7132 list at all, is now a command word with a fixed tariff of nine.</w:t>
       </w:r>
     </w:p>
     <w:p>
@@ -3723,7 +3736,7 @@
                 <w:i w:val="0"/>
                 <w:sz w:val="19"/>
               </w:rPr>
-              <w:t>4, 9, 25</w:t>
+              <w:t>1, 4, 9, 25</w:t>
             </w:r>
           </w:p>
         </w:tc>
@@ -4361,6 +4374,19 @@
         <w:rPr>
           <w:b w:val="0"/>
           <w:i w:val="0"/>
+          <w:sz w:val="21"/>
+        </w:rPr>
+        <w:t xml:space="preserve">Learners that make use of relevant theories, concepts, models and frameworks in their responses, that are not the direct focus of a question are making use of sophisticated concepts. The appropriate use of these sophisticated concepts strengthens the quality of their analysis.</w:t>
+      </w:r>
+    </w:p>
+    <w:p>
+      <w:pPr>
+        <w:ind w:left="397"/>
+      </w:pPr>
+      <w:r>
+        <w:rPr>
+          <w:b w:val="0"/>
+          <w:i w:val="0"/>
           <w:sz w:val="18"/>
         </w:rPr>
         <w:t>AQA 7137 and 7138 specification, Annex: Sophisticated concepts</w:t>
@@ -4434,7 +4460,7 @@
           <w:i w:val="0"/>
           <w:sz w:val="21"/>
         </w:rPr>
-        <w:t>, which also tells you the 15 mark grid runs to five levels.</w:t>
+        <w:t>, and the sample mark schemes confirm the grid runs to five levels.</w:t>
       </w:r>
     </w:p>
     <w:p>
@@ -4670,7 +4696,7 @@
                 <w:i w:val="0"/>
                 <w:sz w:val="19"/>
               </w:rPr>
-              <w:t xml:space="preserve"> / 8 items</w:t>
+              <w:t xml:space="preserve"> / 11 items</w:t>
             </w:r>
           </w:p>
         </w:tc>
@@ -4686,7 +4712,7 @@
                 <w:i w:val="0"/>
                 <w:sz w:val="19"/>
               </w:rPr>
-              <w:t>Price and income elasticity of demand. Correlation, strong or weak and positive or negative. Labour productivity. Capacity utilisation. Opportunity cost. Economies of scale. Stakeholder against shareholder approaches.</w:t>
+              <w:t>Price and income elasticity of demand. Correlation, strong or weak and positive or negative. Labour productivity. Capacity utilisation. Opportunity cost. Economies of scale. Stakeholder vs shareholder approaches. ESG metrics. Risk vs uncertainty. Strategic drift.</w:t>
             </w:r>
           </w:p>
         </w:tc>
@@ -4925,7 +4951,7 @@
           <w:i w:val="0"/>
           <w:sz w:val="21"/>
         </w:rPr>
-        <w:t xml:space="preserve"> Justify and To what extent are off the list. Assess is on it, at a fixed nine marks.</w:t>
+        <w:t xml:space="preserve"> Calculate, Describe, Justify and To what extent are off the list. Assess is on it, at a fixed nine marks.</w:t>
       </w:r>
     </w:p>
     <w:p>
@@ -5305,7 +5331,7 @@
                 <w:i w:val="0"/>
                 <w:sz w:val="19"/>
               </w:rPr>
-              <w:t>AQA AS and A-level Business 7137, 7138 specification, version 1.1, November 2025. aqa.org.uk/subjects/business/as-and-a-level/business-7137-7138</w:t>
+              <w:t>AQA AS and A-level Business 7137, 7138 specification, version 1.1, November 2025. aqa.org.uk/7138</w:t>
             </w:r>
           </w:p>
         </w:tc>

</xml_diff>